<commit_message>
feat: integrate Local organization and operational scope through CC-21
</commit_message>
<xml_diff>
--- a/docs/manuales_solucion/word/01_produccion.docx
+++ b/docs/manuales_solucion/word/01_produccion.docx
@@ -23,7 +23,7 @@
         <w:pStyle w:val="ListBullet"/>
       </w:pPr>
       <w:r>
-        <w:t>Alcance por ambiente: Local actual y QA; las mejoras pendientes de promoción se indican expresamente</w:t>
+        <w:t>Alcance por ambiente: Local y QA; las capacidades futuras se indican expresamente</w:t>
       </w:r>
     </w:p>
     <w:p>
@@ -31,7 +31,7 @@
         <w:pStyle w:val="ListBullet"/>
       </w:pPr>
       <w:r>
-        <w:t>Última revisión: 2026-09-14</w:t>
+        <w:t>Última revisión: 2026-10-14 (costo estimado confirmado por División sólo Local; sin promoción QA)</w:t>
       </w:r>
     </w:p>
     <w:p>
@@ -46,10 +46,7 @@
           <w:rFonts w:ascii="Consolas" w:hAnsi="Consolas"/>
           <w:sz w:val="18"/>
         </w:rPr>
-        <w:t>b63cdad</w:t>
-      </w:r>
-      <w:r>
-        <w:t>; mejoras Local de formularios, margen y evidencia pendientes de promoción</w:t>
+        <w:t>e57237f</w:t>
       </w:r>
     </w:p>
     <w:p>
@@ -57,7 +54,7 @@
         <w:pStyle w:val="ListBullet"/>
       </w:pPr>
       <w:r>
-        <w:t>Capacidades cubiertas: productos y servicios, recetas versionadas, maquinaria, planeación multídía, órdenes, etapas, entrega previa de materiales, devolución de sobrantes, producto terminado y reportes estándar</w:t>
+        <w:t>Capacidades cubiertas: productos y servicios, recetas versionadas, maquinaria, planeación multídía, órdenes, etapas, margen sobre costo sin tope, evidencia de recepción y cierre con adjuntos, entrega previa de materiales, devolución de sobrantes, producto terminado y reportes estándar</w:t>
       </w:r>
     </w:p>
     <w:p>
@@ -86,7 +83,7 @@
         <w:rPr>
           <w:b/>
         </w:rPr>
-        <w:t>Disponible en Local; pendiente de promoción a QA.</w:t>
+        <w:t>Disponible en Local y QA.</w:t>
       </w:r>
       <w:r>
         <w:t xml:space="preserve"> Si un dato es inválido, el formulario muestra una explicación junto al campo y un resumen desde el que puede ir al control correspondiente. Corrija el dato indicado y vuelva a guardar; la captura se conserva mientras el formulario permanezca abierto. En partidas, revise la fila señalada y seleccione nuevamente el registro del catálogo si corresponde.</w:t>
@@ -357,7 +354,7 @@
               <w:rPr>
                 <w:sz w:val="19"/>
               </w:rPr>
-              <w:t>Pendiente de promoción</w:t>
+              <w:t>Desplegado; aceptación funcional pendiente</w:t>
             </w:r>
           </w:p>
         </w:tc>
@@ -434,7 +431,7 @@
               <w:rPr>
                 <w:sz w:val="19"/>
               </w:rPr>
-              <w:t>Pendiente de promoción</w:t>
+              <w:t>Desplegado; aceptación funcional pendiente</w:t>
             </w:r>
           </w:p>
         </w:tc>
@@ -848,7 +845,7 @@
               <w:rPr>
                 <w:sz w:val="19"/>
               </w:rPr>
-              <w:t>Calendarios configurables, turnos, festivos y ausencias</w:t>
+              <w:t>Órdenes manuales por División y costos originales confirmados</w:t>
             </w:r>
           </w:p>
         </w:tc>
@@ -872,6 +869,237 @@
               <w:rPr>
                 <w:sz w:val="19"/>
               </w:rPr>
+              <w:t>Implementado; validación Local</w:t>
+            </w:r>
+          </w:p>
+        </w:tc>
+        <w:tc>
+          <w:tcPr>
+            <w:tcW w:type="dxa" w:w="2211"/>
+            <w:vAlign w:val="center"/>
+            <w:tcMar>
+              <w:top w:w="85" w:type="dxa"/>
+              <w:bottom w:w="85" w:type="dxa"/>
+              <w:left w:w="100" w:type="dxa"/>
+              <w:right w:w="100" w:type="dxa"/>
+            </w:tcMar>
+            <w:shd w:fill="FFFFFF"/>
+          </w:tcPr>
+          <w:p>
+            <w:pPr>
+              <w:spacing w:after="0" w:line="240" w:lineRule="auto"/>
+            </w:pPr>
+            <w:r>
+              <w:rPr>
+                <w:sz w:val="19"/>
+              </w:rPr>
+              <w:t>No promovido</w:t>
+            </w:r>
+          </w:p>
+        </w:tc>
+      </w:tr>
+      <w:tr>
+        <w:trPr>
+          <w:cantSplit/>
+        </w:trPr>
+        <w:tc>
+          <w:tcPr>
+            <w:tcW w:type="dxa" w:w="4989"/>
+            <w:vAlign w:val="center"/>
+            <w:tcMar>
+              <w:top w:w="85" w:type="dxa"/>
+              <w:bottom w:w="85" w:type="dxa"/>
+              <w:left w:w="100" w:type="dxa"/>
+              <w:right w:w="100" w:type="dxa"/>
+            </w:tcMar>
+            <w:shd w:fill="F2F5F7"/>
+          </w:tcPr>
+          <w:p>
+            <w:pPr>
+              <w:spacing w:after="0" w:line="240" w:lineRule="auto"/>
+            </w:pPr>
+            <w:r>
+              <w:rPr>
+                <w:sz w:val="19"/>
+              </w:rPr>
+              <w:t>Fabricación originada en pedido por División</w:t>
+            </w:r>
+          </w:p>
+        </w:tc>
+        <w:tc>
+          <w:tcPr>
+            <w:tcW w:type="dxa" w:w="2211"/>
+            <w:vAlign w:val="center"/>
+            <w:tcMar>
+              <w:top w:w="85" w:type="dxa"/>
+              <w:bottom w:w="85" w:type="dxa"/>
+              <w:left w:w="100" w:type="dxa"/>
+              <w:right w:w="100" w:type="dxa"/>
+            </w:tcMar>
+            <w:shd w:fill="F2F5F7"/>
+          </w:tcPr>
+          <w:p>
+            <w:pPr>
+              <w:spacing w:after="0" w:line="240" w:lineRule="auto"/>
+            </w:pPr>
+            <w:r>
+              <w:rPr>
+                <w:sz w:val="19"/>
+              </w:rPr>
+              <w:t>Implementado; validación Local</w:t>
+            </w:r>
+          </w:p>
+        </w:tc>
+        <w:tc>
+          <w:tcPr>
+            <w:tcW w:type="dxa" w:w="2211"/>
+            <w:vAlign w:val="center"/>
+            <w:tcMar>
+              <w:top w:w="85" w:type="dxa"/>
+              <w:bottom w:w="85" w:type="dxa"/>
+              <w:left w:w="100" w:type="dxa"/>
+              <w:right w:w="100" w:type="dxa"/>
+            </w:tcMar>
+            <w:shd w:fill="F2F5F7"/>
+          </w:tcPr>
+          <w:p>
+            <w:pPr>
+              <w:spacing w:after="0" w:line="240" w:lineRule="auto"/>
+            </w:pPr>
+            <w:r>
+              <w:rPr>
+                <w:sz w:val="19"/>
+              </w:rPr>
+              <w:t>No promovido</w:t>
+            </w:r>
+          </w:p>
+        </w:tc>
+      </w:tr>
+      <w:tr>
+        <w:trPr>
+          <w:cantSplit/>
+        </w:trPr>
+        <w:tc>
+          <w:tcPr>
+            <w:tcW w:type="dxa" w:w="4989"/>
+            <w:vAlign w:val="center"/>
+            <w:tcMar>
+              <w:top w:w="85" w:type="dxa"/>
+              <w:bottom w:w="85" w:type="dxa"/>
+              <w:left w:w="100" w:type="dxa"/>
+              <w:right w:w="100" w:type="dxa"/>
+            </w:tcMar>
+            <w:shd w:fill="FFFFFF"/>
+          </w:tcPr>
+          <w:p>
+            <w:pPr>
+              <w:spacing w:after="0" w:line="240" w:lineRule="auto"/>
+            </w:pPr>
+            <w:r>
+              <w:rPr>
+                <w:sz w:val="19"/>
+              </w:rPr>
+              <w:t>Costo unitario estimado confirmado por División para cotizaciones</w:t>
+            </w:r>
+          </w:p>
+        </w:tc>
+        <w:tc>
+          <w:tcPr>
+            <w:tcW w:type="dxa" w:w="2211"/>
+            <w:vAlign w:val="center"/>
+            <w:tcMar>
+              <w:top w:w="85" w:type="dxa"/>
+              <w:bottom w:w="85" w:type="dxa"/>
+              <w:left w:w="100" w:type="dxa"/>
+              <w:right w:w="100" w:type="dxa"/>
+            </w:tcMar>
+            <w:shd w:fill="FFFFFF"/>
+          </w:tcPr>
+          <w:p>
+            <w:pPr>
+              <w:spacing w:after="0" w:line="240" w:lineRule="auto"/>
+            </w:pPr>
+            <w:r>
+              <w:rPr>
+                <w:sz w:val="19"/>
+              </w:rPr>
+              <w:t>Disponible sólo Local</w:t>
+            </w:r>
+          </w:p>
+        </w:tc>
+        <w:tc>
+          <w:tcPr>
+            <w:tcW w:type="dxa" w:w="2211"/>
+            <w:vAlign w:val="center"/>
+            <w:tcMar>
+              <w:top w:w="85" w:type="dxa"/>
+              <w:bottom w:w="85" w:type="dxa"/>
+              <w:left w:w="100" w:type="dxa"/>
+              <w:right w:w="100" w:type="dxa"/>
+            </w:tcMar>
+            <w:shd w:fill="FFFFFF"/>
+          </w:tcPr>
+          <w:p>
+            <w:pPr>
+              <w:spacing w:after="0" w:line="240" w:lineRule="auto"/>
+            </w:pPr>
+            <w:r>
+              <w:rPr>
+                <w:sz w:val="19"/>
+              </w:rPr>
+              <w:t>No promovido</w:t>
+            </w:r>
+          </w:p>
+        </w:tc>
+      </w:tr>
+      <w:tr>
+        <w:trPr>
+          <w:cantSplit/>
+        </w:trPr>
+        <w:tc>
+          <w:tcPr>
+            <w:tcW w:type="dxa" w:w="4989"/>
+            <w:vAlign w:val="center"/>
+            <w:tcMar>
+              <w:top w:w="85" w:type="dxa"/>
+              <w:bottom w:w="85" w:type="dxa"/>
+              <w:left w:w="100" w:type="dxa"/>
+              <w:right w:w="100" w:type="dxa"/>
+            </w:tcMar>
+            <w:shd w:fill="F2F5F7"/>
+          </w:tcPr>
+          <w:p>
+            <w:pPr>
+              <w:spacing w:after="0" w:line="240" w:lineRule="auto"/>
+            </w:pPr>
+            <w:r>
+              <w:rPr>
+                <w:sz w:val="19"/>
+              </w:rPr>
+              <w:t>Calendarios configurables, turnos, festivos y ausencias</w:t>
+            </w:r>
+          </w:p>
+        </w:tc>
+        <w:tc>
+          <w:tcPr>
+            <w:tcW w:type="dxa" w:w="2211"/>
+            <w:vAlign w:val="center"/>
+            <w:tcMar>
+              <w:top w:w="85" w:type="dxa"/>
+              <w:bottom w:w="85" w:type="dxa"/>
+              <w:left w:w="100" w:type="dxa"/>
+              <w:right w:w="100" w:type="dxa"/>
+            </w:tcMar>
+            <w:shd w:fill="F2F5F7"/>
+          </w:tcPr>
+          <w:p>
+            <w:pPr>
+              <w:spacing w:after="0" w:line="240" w:lineRule="auto"/>
+            </w:pPr>
+            <w:r>
+              <w:rPr>
+                <w:sz w:val="19"/>
+              </w:rPr>
               <w:t>No disponible</w:t>
             </w:r>
           </w:p>
@@ -886,7 +1114,7 @@
               <w:left w:w="100" w:type="dxa"/>
               <w:right w:w="100" w:type="dxa"/>
             </w:tcMar>
-            <w:shd w:fill="FFFFFF"/>
+            <w:shd w:fill="F2F5F7"/>
           </w:tcPr>
           <w:p>
             <w:pPr>
@@ -1616,7 +1844,7 @@
         <w:ind w:left="283" w:hanging="283"/>
       </w:pPr>
       <w:r>
-        <w:t>1. Seleccione una receta aprobada, cantidad, inicio planeado, días productivos, fecha requerida, prioridad y responsables.</w:t>
+        <w:t>1. En Local seleccione explícitamente la División autorizada y después una receta aprobada entre las elegibles. Sociedad y moneda de costo se derivan de esa División. Capture cantidad, inicio planeado, días productivos, fecha requerida, prioridad y responsables de esa División. Cambiar División invalida las selecciones y validación anteriores. En QA se conserva el recorrido base.</w:t>
       </w:r>
     </w:p>
     <w:p>
@@ -1624,7 +1852,7 @@
         <w:ind w:left="283" w:hanging="283"/>
       </w:pPr>
       <w:r>
-        <w:t>2. Revise el horizonte y el desglose diario de material, mano de obra y maquinaria.</w:t>
+        <w:t>2. Revise el horizonte y el desglose diario de material, mano de obra y maquinaria. En Local los materiales deben tener existencias/costos compatibles en almacenes de la División y las tarifas de puesto/máquina deben estar confirmadas en moneda Sociedad. Cero es válido; una tarifa histórica sin moneda no es utilizable.</w:t>
       </w:r>
     </w:p>
     <w:p>
@@ -1675,7 +1903,7 @@
         <w:t>Producción &gt; Órdenes</w:t>
       </w:r>
       <w:r>
-        <w:t xml:space="preserve">. Si la receta corresponde a un servicio, registre la evidencia inicial antes de pasar a espera de recursos o iniciar (mejora Local pendiente de QA). Inicie la orden. </w:t>
+        <w:t xml:space="preserve">. Si la receta corresponde a un servicio, registre la evidencia inicial antes de pasar a espera de recursos o iniciar. Inicie la orden. </w:t>
       </w:r>
       <w:r>
         <w:rPr>
@@ -1684,7 +1912,7 @@
         <w:t>En producción</w:t>
       </w:r>
       <w:r>
-        <w:t xml:space="preserve"> exige la salida completa previamente confirmada y vuelve a validar responsables elegibles y maquinaria disponible. Cambiar el estatus no descuenta inventario.</w:t>
+        <w:t xml:space="preserve"> exige la salida completa previamente confirmada y vuelve a validar responsables elegibles y maquinaria disponible. En órdenes Local por División también verifica los trabajadores comprometidos y su puesto vigente; reanudar repite esas verificaciones sin cambiar las tarifas históricas. Cambiar el estatus no descuenta inventario.</w:t>
       </w:r>
     </w:p>
     <w:p>
@@ -1736,7 +1964,7 @@
     </w:p>
     <w:p>
       <w:r>
-        <w:t xml:space="preserve">Si una creación fallida dejó reservas, use </w:t>
+        <w:t xml:space="preserve">Si el resultado de un alta es incierto, conserve la captura y reintente la misma operación; no cambie de clave ni cree otra orden. El intento durable permite comprobar las partidas antes de reservar y recuperar una respuesta ya completada sin repetir efectos. Si una creación fallida dejó reservas, use </w:t>
       </w:r>
       <w:r>
         <w:rPr>
@@ -1753,6 +1981,160 @@
         <w:pStyle w:val="Heading1"/>
       </w:pPr>
       <w:r>
+        <w:t>Fabricar una partida de pedido por División</w:t>
+      </w:r>
+    </w:p>
+    <w:p>
+      <w:r>
+        <w:rPr>
+          <w:b/>
+        </w:rPr>
+        <w:t>Disponible en Local; no promovido a QA.</w:t>
+      </w:r>
+      <w:r>
+        <w:t xml:space="preserve"> La solicitud comercial fija el producto, la División, la cantidad y la unidad. Producción conserva la decisión de receta, fechas, responsables y liberación.</w:t>
+      </w:r>
+    </w:p>
+    <w:p>
+      <w:pPr>
+        <w:ind w:left="283" w:hanging="283"/>
+      </w:pPr>
+      <w:r>
+        <w:t xml:space="preserve">1. Abra </w:t>
+      </w:r>
+      <w:r>
+        <w:rPr>
+          <w:b/>
+        </w:rPr>
+        <w:t>Producción &gt; Órdenes &gt; Solicitudes desde pedidos</w:t>
+      </w:r>
+      <w:r>
+        <w:t xml:space="preserve">. Busque la solicitud y use </w:t>
+      </w:r>
+      <w:r>
+        <w:rPr>
+          <w:b/>
+        </w:rPr>
+        <w:t>Anterior/Siguiente</w:t>
+      </w:r>
+      <w:r>
+        <w:t xml:space="preserve"> cuando haya más resultados. También puede entrar con </w:t>
+      </w:r>
+      <w:r>
+        <w:rPr>
+          <w:b/>
+        </w:rPr>
+        <w:t>Planificar orden de producción</w:t>
+      </w:r>
+      <w:r>
+        <w:t xml:space="preserve"> desde el seguimiento del pedido en Ventas si dispone del permiso de liberación.</w:t>
+      </w:r>
+    </w:p>
+    <w:p>
+      <w:pPr>
+        <w:ind w:left="283" w:hanging="283"/>
+      </w:pPr>
+      <w:r>
+        <w:t xml:space="preserve">2. Pulse </w:t>
+      </w:r>
+      <w:r>
+        <w:rPr>
+          <w:b/>
+        </w:rPr>
+        <w:t>Planificar solicitud</w:t>
+      </w:r>
+      <w:r>
+        <w:t>. Revise los datos de origen de sólo lectura; no sustituya una partida comercial mediante una orden manual.</w:t>
+      </w:r>
+    </w:p>
+    <w:p>
+      <w:pPr>
+        <w:ind w:left="283" w:hanging="283"/>
+      </w:pPr>
+      <w:r>
+        <w:t>3. Seleccione una receta aprobada del producto solicitado y de la División. Capture inicio planeado, días productivos, fecha requerida, prioridad, responsable general y responsables de etapa. Sociedad y moneda del costo se derivan de la División.</w:t>
+      </w:r>
+    </w:p>
+    <w:p>
+      <w:pPr>
+        <w:ind w:left="283" w:hanging="283"/>
+      </w:pPr>
+      <w:r>
+        <w:t xml:space="preserve">4. Use </w:t>
+      </w:r>
+      <w:r>
+        <w:rPr>
+          <w:b/>
+        </w:rPr>
+        <w:t>Validar recursos</w:t>
+      </w:r>
+      <w:r>
+        <w:t>. La validación comprueba el pedido de origen, materiales, capacidad y tarifas confirmadas; no genera una orden por sí sola.</w:t>
+      </w:r>
+    </w:p>
+    <w:p>
+      <w:pPr>
+        <w:ind w:left="283" w:hanging="283"/>
+      </w:pPr>
+      <w:r>
+        <w:t xml:space="preserve">5. Pulse </w:t>
+      </w:r>
+      <w:r>
+        <w:rPr>
+          <w:b/>
+        </w:rPr>
+        <w:t>Generar orden</w:t>
+      </w:r>
+      <w:r>
+        <w:t>. La liberación vuelve a validar el origen, reserva materiales y compromete capacidad con el mismo criterio que una orden manual por División. Cada solicitud admite una única orden.</w:t>
+      </w:r>
+    </w:p>
+    <w:p>
+      <w:pPr>
+        <w:ind w:left="283" w:hanging="283"/>
+      </w:pPr>
+      <w:r>
+        <w:t>6. Ejecute las etapas, entregue materiales y termine la orden mediante el recorrido habitual. Almacenes debe recibir físicamente el producto terminado.</w:t>
+      </w:r>
+    </w:p>
+    <w:p>
+      <w:pPr>
+        <w:ind w:left="283" w:hanging="283"/>
+      </w:pPr>
+      <w:r>
+        <w:t>7. Ventas actualiza el seguimiento y concilia la recepción con el pedido. Terminar Producción no habilita por sí solo el despacho comercial.</w:t>
+      </w:r>
+    </w:p>
+    <w:p>
+      <w:r>
+        <w:t xml:space="preserve">Consultar la bandeja requiere </w:t>
+      </w:r>
+      <w:r>
+        <w:rPr>
+          <w:rFonts w:ascii="Consolas" w:hAnsi="Consolas"/>
+          <w:sz w:val="18"/>
+        </w:rPr>
+        <w:t>production.order.read</w:t>
+      </w:r>
+      <w:r>
+        <w:t xml:space="preserve">; tener sólo permiso de liberación no habilita esa consulta. Generar la orden requiere </w:t>
+      </w:r>
+      <w:r>
+        <w:rPr>
+          <w:rFonts w:ascii="Consolas" w:hAnsi="Consolas"/>
+          <w:sz w:val="18"/>
+        </w:rPr>
+        <w:t>production.order.release</w:t>
+      </w:r>
+      <w:r>
+        <w:t xml:space="preserve"> y alcance vigente. Si la solicitud ya tiene orden, consulte la existente. Si se canceló o cambió su origen, actualice el seguimiento antes de continuar. Ante una respuesta incierta conserve la captura y reintente; si se informa recuperación pendiente, resuelva ese intento antes de crear otro o cancelar la solicitud.</w:t>
+      </w:r>
+    </w:p>
+    <w:p>
+      <w:pPr>
+        <w:pStyle w:val="Heading1"/>
+      </w:pPr>
+      <w:r>
         <w:t>Margen esperado de productos y servicios</w:t>
       </w:r>
     </w:p>
@@ -1761,7 +2143,7 @@
         <w:rPr>
           <w:b/>
         </w:rPr>
-        <w:t>Disponible en Local; pendiente de promoción a QA.</w:t>
+        <w:t>Disponible en Local y QA.</w:t>
       </w:r>
       <w:r>
         <w:t xml:space="preserve"> En </w:t>
@@ -1803,7 +2185,7 @@
         <w:rPr>
           <w:b/>
         </w:rPr>
-        <w:t>Disponible en Local; pendiente de promoción a QA.</w:t>
+        <w:t>Disponible en Local y QA.</w:t>
       </w:r>
       <w:r>
         <w:t xml:space="preserve"> Aplica únicamente a órdenes de Producción cuya receta corresponde a un servicio. Las órdenes de producto mantienen su recorrido. Las órdenes comerciales de servicio de Ventas son un flujo distinto.</w:t>
@@ -2078,7 +2460,7 @@
               <w:rPr>
                 <w:sz w:val="19"/>
               </w:rPr>
-              <w:t>Documentos PDF, TXT, DOCX o XLSX</w:t>
+              <w:t>Documentos PDF, TXT en UTF-8, DOCX o XLSX</w:t>
             </w:r>
           </w:p>
         </w:tc>
@@ -2829,7 +3211,7 @@
     </w:p>
     <w:p>
       <w:r>
-        <w:t>Al terminar una orden, Producción expone a Almacenes una proyección mínima: folio, producto vinculado, cantidad, unidad y costo unitario. El almacenista confirma una o varias recepciones. Producción no incrementa existencias por sí misma y no expone receta, responsables o costos completos al rol receptor.</w:t>
+        <w:t>Al terminar una orden, Producción expone a Almacenes una proyección mínima: folio, producto vinculado, cantidad, unidad y costo unitario. En el recorrido Local por División incluye el contexto y costo original exacto a seis decimales; Almacén valida artículo y destino elegibles en esa División y toma el costo del productor. No se captura un costo sustituto ni se infiere del maestro. El almacenista confirma una o varias recepciones. Producción no incrementa existencias por sí misma y no expone receta, responsables o costos completos al rol receptor.</w:t>
       </w:r>
     </w:p>
     <w:p>
@@ -3152,6 +3534,336 @@
         <w:t>Conserve folio de orden, estado, fase, fecha y referencia de correlación cuando aparezca. No registre salidas manuales para corregir una integración pendiente: reintente desde la acción autorizada o escale a soporte.</w:t>
       </w:r>
     </w:p>
+    <w:p>
+      <w:pPr>
+        <w:pStyle w:val="Heading1"/>
+      </w:pPr>
+      <w:r>
+        <w:t>Demoras de comunicación en Local</w:t>
+      </w:r>
+    </w:p>
+    <w:p>
+      <w:r>
+        <w:t>Mejora disponible solo en Local, pendiente de QA: la espera de cada petición incluye la descarga de la respuesta. Un fallo conserva la captura mientras permanezca abierto el formulario; no realiza un nuevo envío automáticamente. Consulte el estado del registro antes de repetir una operación cuyo resultado no se confirmó.</w:t>
+      </w:r>
+    </w:p>
+    <w:p>
+      <w:r>
+        <w:t>En órdenes de servicio, un aviso distingue la recepción y el cierre escritos ya guardados del avance pendiente de confirmar. Los campos confirmados quedan bloqueados porque la evidencia no se sobrescribe; un fallo posterior no significa que se hayan perdido esos textos.</w:t>
+      </w:r>
+    </w:p>
+    <w:p>
+      <w:pPr>
+        <w:pStyle w:val="Heading1"/>
+      </w:pPr>
+      <w:r>
+        <w:t>Asignar máquinas y productos a Divisiones</w:t>
+      </w:r>
+    </w:p>
+    <w:p>
+      <w:r>
+        <w:t>Disponible sólo en Local. Las asignaciones y consultas de máquinas respetan División y preparan el alta manual dimensionada Local. No cambian recetas, órdenes o movimientos históricos. No activa Contabilidad ni análisis de Costos.</w:t>
+      </w:r>
+    </w:p>
+    <w:p>
+      <w:r>
+        <w:t xml:space="preserve">En Producción → Productos y servicios o Recursos → Maquinaria, abra </w:t>
+      </w:r>
+      <w:r>
+        <w:rPr>
+          <w:b/>
+        </w:rPr>
+        <w:t>Asignación por División</w:t>
+      </w:r>
+      <w:r>
+        <w:t xml:space="preserve"> en la tarjeta. Necesita lectura del catálogo y una sesión con alcance organizacional vigente; para guardar necesita además actualizar ese tipo de recurso.</w:t>
+      </w:r>
+    </w:p>
+    <w:p>
+      <w:pPr>
+        <w:ind w:left="283" w:hanging="283"/>
+      </w:pPr>
+      <w:r>
+        <w:t>1. Busque una División por código o nombre y selecciónela entre las autorizadas. Sociedad se deriva de esa División.</w:t>
+      </w:r>
+    </w:p>
+    <w:p>
+      <w:pPr>
+        <w:ind w:left="283" w:hanging="283"/>
+      </w:pPr>
+      <w:r>
+        <w:t>2. Para una máquina pendiente, un usuario con alcance completo puede guardar su primera División. Después queda fija; solicite revisión si necesita corregir su ubicación. La máquina debe estar activa.</w:t>
+      </w:r>
+    </w:p>
+    <w:p>
+      <w:pPr>
+        <w:ind w:left="283" w:hanging="283"/>
+      </w:pPr>
+      <w:r>
+        <w:t xml:space="preserve">3. Para un producto o servicio, elija opcionalmente un centro predeterminado activo de esa División. </w:t>
+      </w:r>
+      <w:r>
+        <w:rPr>
+          <w:b/>
+        </w:rPr>
+        <w:t>Sin centro</w:t>
+      </w:r>
+      <w:r>
+        <w:t xml:space="preserve"> conserva la asignación sin referencia. Cambiar de División limpia la selección anterior.</w:t>
+      </w:r>
+    </w:p>
+    <w:p>
+      <w:pPr>
+        <w:ind w:left="283" w:hanging="283"/>
+      </w:pPr>
+      <w:r>
+        <w:t>4. Guarde. El mismo producto/servicio puede tener asignaciones en varias Divisiones sin duplicar su ficha. Sólo los maestros activos permiten activar asignaciones.</w:t>
+      </w:r>
+    </w:p>
+    <w:p>
+      <w:pPr>
+        <w:ind w:left="283" w:hanging="283"/>
+      </w:pPr>
+      <w:r>
+        <w:t xml:space="preserve">5. En </w:t>
+      </w:r>
+      <w:r>
+        <w:rPr>
+          <w:b/>
+        </w:rPr>
+        <w:t>Asignaciones existentes</w:t>
+      </w:r>
+      <w:r>
+        <w:t>, abra una asignación para consultar o cambiar su estado. Desactivarla conserva el centro histórico; reactivarla vuelve a validar el recurso, División y centro.</w:t>
+      </w:r>
+    </w:p>
+    <w:p>
+      <w:r>
+        <w:t>Los centros no son obligatorios por preparar el sistema. Se exigirán únicamente en los flujos de imputación habilitados. Sin acceso al catálogo, se conserva una referencia existente; para validar una asignación activa con centro necesita acceso y disponibilidad de Costing. Desactivar permite conservar historia aunque ese catálogo no esté disponible.</w:t>
+      </w:r>
+    </w:p>
+    <w:p>
+      <w:pPr>
+        <w:pStyle w:val="Heading2"/>
+      </w:pPr>
+      <w:r>
+        <w:t>Confirmar costo estimado para Ventas en Local</w:t>
+      </w:r>
+    </w:p>
+    <w:p>
+      <w:pPr>
+        <w:ind w:left="283" w:hanging="283"/>
+      </w:pPr>
+      <w:r>
+        <w:t xml:space="preserve">1. En </w:t>
+      </w:r>
+      <w:r>
+        <w:rPr>
+          <w:b/>
+        </w:rPr>
+        <w:t>Productos y servicios &gt; Asignación por División</w:t>
+      </w:r>
+      <w:r>
+        <w:t>, guarde y seleccione una asignación activa. Revise la Sociedad y su moneda base; el costo se captura por unidad del producto o servicio en esa moneda.</w:t>
+      </w:r>
+    </w:p>
+    <w:p>
+      <w:pPr>
+        <w:ind w:left="283" w:hanging="283"/>
+      </w:pPr>
+      <w:r>
+        <w:t xml:space="preserve">2. Capture el costo unitario con hasta seis decimales y pulse </w:t>
+      </w:r>
+      <w:r>
+        <w:rPr>
+          <w:b/>
+        </w:rPr>
+        <w:t>Confirmar costo</w:t>
+      </w:r>
+      <w:r>
+        <w:t>. Cero es válido. Sólo quien puede actualizar el producto o servicio realiza esta acción; un conflicto de revisión requiere volver a abrir la asignación.</w:t>
+      </w:r>
+    </w:p>
+    <w:p>
+      <w:pPr>
+        <w:ind w:left="283" w:hanging="283"/>
+      </w:pPr>
+      <w:r>
+        <w:t xml:space="preserve">3. Para dejar de usarlo en cotizaciones nuevas, pulse </w:t>
+      </w:r>
+      <w:r>
+        <w:rPr>
+          <w:b/>
+        </w:rPr>
+        <w:t>Retirar costo confirmado</w:t>
+      </w:r>
+      <w:r>
+        <w:t>. La acción es explícita y no borra documentos anteriores. Una asignación inactiva no ofrece confirmación nueva.</w:t>
+      </w:r>
+    </w:p>
+    <w:p>
+      <w:r>
+        <w:t>Ventas utiliza sólo la confirmación de la División correspondiente. Si no existe o cambió la Sociedad o su moneda base, el estimado queda pendiente y Ventas no sustituye automáticamente el costo global del maestro. Este costo es una referencia comercial, no el costo real de una orden ni un asiento contable.</w:t>
+      </w:r>
+    </w:p>
+    <w:p>
+      <w:r>
+        <w:t>Un rechazo conserva la captura. Si existe un conflicto de revisión, vuelva a abrir la asignación para revisar lo guardado antes de reintentar. La falta de permisos requiere un administrador autorizado. El texto de centro de costos del maestro y el área de la máquina son datos heredados: no se convierten automáticamente a estas referencias. Los registros existentes permanecen pendientes hasta asignarlos explícitamente.</w:t>
+      </w:r>
+    </w:p>
+    <w:p>
+      <w:pPr>
+        <w:pStyle w:val="Heading1"/>
+      </w:pPr>
+      <w:r>
+        <w:t>Confirmar la tarifa de una máquina</w:t>
+      </w:r>
+    </w:p>
+    <w:p>
+      <w:r>
+        <w:t xml:space="preserve">Disponible sólo en Local. En </w:t>
+      </w:r>
+      <w:r>
+        <w:rPr>
+          <w:b/>
+        </w:rPr>
+        <w:t>Producción → Recursos → Maquinaria</w:t>
+      </w:r>
+      <w:r>
+        <w:t xml:space="preserve">, abra </w:t>
+      </w:r>
+      <w:r>
+        <w:rPr>
+          <w:b/>
+        </w:rPr>
+        <w:t>Asignación por División</w:t>
+      </w:r>
+      <w:r>
+        <w:t>. Necesita consultar la máquina y permiso para actualizarla. La División física se asigna explícitamente y después queda fija.</w:t>
+      </w:r>
+    </w:p>
+    <w:p>
+      <w:pPr>
+        <w:ind w:left="283" w:hanging="283"/>
+      </w:pPr>
+      <w:r>
+        <w:t xml:space="preserve">1. Revise la División y la </w:t>
+      </w:r>
+      <w:r>
+        <w:rPr>
+          <w:b/>
+        </w:rPr>
+        <w:t>Moneda base de la Sociedad</w:t>
+      </w:r>
+      <w:r>
+        <w:t xml:space="preserve"> mostrada. La moneda se deriva de esa División y no se elige por separado.</w:t>
+      </w:r>
+    </w:p>
+    <w:p>
+      <w:pPr>
+        <w:ind w:left="283" w:hanging="283"/>
+      </w:pPr>
+      <w:r>
+        <w:t xml:space="preserve">2. Capture </w:t>
+      </w:r>
+      <w:r>
+        <w:rPr>
+          <w:b/>
+        </w:rPr>
+        <w:t>Costo por minuto</w:t>
+      </w:r>
+      <w:r>
+        <w:t>; cero es válido y se permiten hasta seis decimales. Revise el importe completo antes de confirmar.</w:t>
+      </w:r>
+    </w:p>
+    <w:p>
+      <w:pPr>
+        <w:ind w:left="283" w:hanging="283"/>
+      </w:pPr>
+      <w:r>
+        <w:t xml:space="preserve">3. Marque </w:t>
+      </w:r>
+      <w:r>
+        <w:rPr>
+          <w:b/>
+        </w:rPr>
+        <w:t>Confirmo este importe en la moneda indicada para operaciones futuras</w:t>
+      </w:r>
+      <w:r>
+        <w:t>. La casilla inicia sin marcar; guardar la División por sí solo no confirma la moneda.</w:t>
+      </w:r>
+    </w:p>
+    <w:p>
+      <w:pPr>
+        <w:ind w:left="283" w:hanging="283"/>
+      </w:pPr>
+      <w:r>
+        <w:t>4. Guarde la tarifa y espere el resultado. Ante rechazo se conserva la captura; revise moneda, permisos y contexto antes de reintentar.</w:t>
+      </w:r>
+    </w:p>
+    <w:p>
+      <w:r>
+        <w:t>Una tarifa anterior sin moneda confirmada sigue pendiente: no se convierte ni se etiqueta automáticamente. Si la Sociedad o su moneda cambian, vuelva a confirmar explícitamente antes de usar la tarifa como costo vigente. El editor general de la máquina conserva la tarifa confirmada al cambiar nombre, capacidad u otros datos; para modificar el costo utilice este panel específico. La tarifa no es un asiento contable.</w:t>
+      </w:r>
+    </w:p>
+    <w:p>
+      <w:pPr>
+        <w:pStyle w:val="Heading1"/>
+      </w:pPr>
+      <w:r>
+        <w:t>Consultar capacidad de máquinas por División</w:t>
+      </w:r>
+    </w:p>
+    <w:p>
+      <w:r>
+        <w:t xml:space="preserve">En el panel </w:t>
+      </w:r>
+      <w:r>
+        <w:rPr>
+          <w:b/>
+        </w:rPr>
+        <w:t>Asignación por División</w:t>
+      </w:r>
+      <w:r>
+        <w:t>, seleccione la fecha y consulte la capacidad. La pantalla muestra hasta 25 máquinas elegibles con su tarifa confirmada y minutos disponibles después de compromisos de ese día. La fecha es obligatoria; el calendario base actual tiene capacidad cero los fines de semana.</w:t>
+      </w:r>
+    </w:p>
+    <w:p>
+      <w:r>
+        <w:t>La consulta considera la misma máquina física y todos sus compromisos activos del día, incluidas órdenes anteriores sin contexto. No libera ni reserva una máquina. Una máquina inactiva, en mantenimiento o sin tarifa confirmada vigente no debe interpretarse como disponible por conservar su registro histórico.</w:t>
+      </w:r>
+    </w:p>
+    <w:p>
+      <w:r>
+        <w:t>La consulta de RH, en cambio, presenta capacidad nominal de trabajadores compartidos y no descuenta ocupación productiva. No sume sus minutos entre Divisiones ni los interprete como disponibilidad libre. Las órdenes manuales Local combinan esa identidad compartida con compromisos globales por persona/día y los compromisos de máquinas para calcular disponibilidad. Si hay compromisos laborales antiguos sin personas identificadas, se bloquea el solapamiento para revisión; no se asignan personas por inferencia. Cancelar libera capacidad conforme al ciclo de la orden. El calendario sigue de lunes a viernes. Esta consulta por sí sola no reserva recursos. La fabricación desde pedidos se planifica mediante una solicitud vinculada; su recepción y conciliación comercial son pasos explícitos.</w:t>
+      </w:r>
+    </w:p>
+    <w:p>
+      <w:pPr>
+        <w:pStyle w:val="Heading1"/>
+      </w:pPr>
+      <w:r>
+        <w:t>Documentos relacionados</w:t>
+      </w:r>
+    </w:p>
+    <w:p>
+      <w:r>
+        <w:t>Registro de esta fuente y su Word (../REGISTRO.md) · Ficha funcional (../../../modulos/01_produccion.md) · Estado por ambiente (../../contexto/ESTADO_ACTUAL.md) · Control de integración por submódulo (../../contexto/CONTROL_CONTABLE.md).</w:t>
+      </w:r>
+    </w:p>
+    <w:p>
+      <w:pPr>
+        <w:pStyle w:val="Heading1"/>
+      </w:pPr>
+      <w:r>
+        <w:t>Imprimir ordenes con identidad de Division en Local</w:t>
+      </w:r>
+    </w:p>
+    <w:p>
+      <w:r>
+        <w:t>Al liberar una orden con contexto, Produccion conserva la identidad de Emisor, Sociedad, Division y la plantilla efectiva. La impresion posterior usa esa copia, incluso si Administracion cambia la plantilla. Una orden antigua sin copia de presentacion informa que no puede reconstruir su aspecto historico.</w:t>
+      </w:r>
+    </w:p>
     <w:sectPr>
       <w:footerReference w:type="default" r:id="rId9"/>
       <w:pgSz w:w="12240" w:h="15840"/>
@@ -3174,7 +3886,7 @@
         <w:color w:val="464646"/>
         <w:sz w:val="16"/>
       </w:rPr>
-      <w:t xml:space="preserve">ERClave  |  Local / QA pendiente  |  14 septiembre 2026  |  </w:t>
+      <w:t xml:space="preserve">ERClave  |  Alcance y revisión en la portada  |  </w:t>
     </w:r>
     <w:fldSimple w:instr="PAGE"/>
   </w:p>

</xml_diff>

<commit_message>
Promueve capacidades operativas Local a candidato QA (CHG-278–336) (#16)
* docs: record QA candidate deployment and pending evidence smoke

* docs: record authorized QA service order fixture

* feat: integrate Local organization and operational scope through CC-21

* fix: validate Local scope acceptance and preserve user audit history

* fix: preserve Local capabilities in QA release (CHG-335)

* docs: authorize staged QA promotion and MXN USD structure (CHG-336)

* feat: inspect QA baseline before governed migration (CHG-336)
</commit_message>
<xml_diff>
--- a/docs/manuales_solucion/word/01_produccion.docx
+++ b/docs/manuales_solucion/word/01_produccion.docx
@@ -23,7 +23,7 @@
         <w:pStyle w:val="ListBullet"/>
       </w:pPr>
       <w:r>
-        <w:t>Alcance por ambiente: Local actual y QA; las mejoras pendientes de promoción se indican expresamente</w:t>
+        <w:t>Alcance por ambiente: Local y QA; las capacidades futuras se indican expresamente</w:t>
       </w:r>
     </w:p>
     <w:p>
@@ -31,7 +31,7 @@
         <w:pStyle w:val="ListBullet"/>
       </w:pPr>
       <w:r>
-        <w:t>Última revisión: 2026-09-14</w:t>
+        <w:t>Última revisión: 2026-10-14 (costo estimado confirmado por División sólo Local; sin promoción QA)</w:t>
       </w:r>
     </w:p>
     <w:p>
@@ -46,10 +46,7 @@
           <w:rFonts w:ascii="Consolas" w:hAnsi="Consolas"/>
           <w:sz w:val="18"/>
         </w:rPr>
-        <w:t>b63cdad</w:t>
-      </w:r>
-      <w:r>
-        <w:t>; mejoras Local de formularios, margen y evidencia pendientes de promoción</w:t>
+        <w:t>e57237f</w:t>
       </w:r>
     </w:p>
     <w:p>
@@ -57,7 +54,7 @@
         <w:pStyle w:val="ListBullet"/>
       </w:pPr>
       <w:r>
-        <w:t>Capacidades cubiertas: productos y servicios, recetas versionadas, maquinaria, planeación multídía, órdenes, etapas, entrega previa de materiales, devolución de sobrantes, producto terminado y reportes estándar</w:t>
+        <w:t>Capacidades cubiertas: productos y servicios, recetas versionadas, maquinaria, planeación multídía, órdenes, etapas, margen sobre costo sin tope, evidencia de recepción y cierre con adjuntos, entrega previa de materiales, devolución de sobrantes, producto terminado y reportes estándar</w:t>
       </w:r>
     </w:p>
     <w:p>
@@ -86,7 +83,7 @@
         <w:rPr>
           <w:b/>
         </w:rPr>
-        <w:t>Disponible en Local; pendiente de promoción a QA.</w:t>
+        <w:t>Disponible en Local y QA.</w:t>
       </w:r>
       <w:r>
         <w:t xml:space="preserve"> Si un dato es inválido, el formulario muestra una explicación junto al campo y un resumen desde el que puede ir al control correspondiente. Corrija el dato indicado y vuelva a guardar; la captura se conserva mientras el formulario permanezca abierto. En partidas, revise la fila señalada y seleccione nuevamente el registro del catálogo si corresponde.</w:t>
@@ -357,7 +354,7 @@
               <w:rPr>
                 <w:sz w:val="19"/>
               </w:rPr>
-              <w:t>Pendiente de promoción</w:t>
+              <w:t>Desplegado; aceptación funcional pendiente</w:t>
             </w:r>
           </w:p>
         </w:tc>
@@ -434,7 +431,7 @@
               <w:rPr>
                 <w:sz w:val="19"/>
               </w:rPr>
-              <w:t>Pendiente de promoción</w:t>
+              <w:t>Desplegado; aceptación funcional pendiente</w:t>
             </w:r>
           </w:p>
         </w:tc>
@@ -848,7 +845,7 @@
               <w:rPr>
                 <w:sz w:val="19"/>
               </w:rPr>
-              <w:t>Calendarios configurables, turnos, festivos y ausencias</w:t>
+              <w:t>Órdenes manuales por División y costos originales confirmados</w:t>
             </w:r>
           </w:p>
         </w:tc>
@@ -872,6 +869,237 @@
               <w:rPr>
                 <w:sz w:val="19"/>
               </w:rPr>
+              <w:t>Implementado; validación Local</w:t>
+            </w:r>
+          </w:p>
+        </w:tc>
+        <w:tc>
+          <w:tcPr>
+            <w:tcW w:type="dxa" w:w="2211"/>
+            <w:vAlign w:val="center"/>
+            <w:tcMar>
+              <w:top w:w="85" w:type="dxa"/>
+              <w:bottom w:w="85" w:type="dxa"/>
+              <w:left w:w="100" w:type="dxa"/>
+              <w:right w:w="100" w:type="dxa"/>
+            </w:tcMar>
+            <w:shd w:fill="FFFFFF"/>
+          </w:tcPr>
+          <w:p>
+            <w:pPr>
+              <w:spacing w:after="0" w:line="240" w:lineRule="auto"/>
+            </w:pPr>
+            <w:r>
+              <w:rPr>
+                <w:sz w:val="19"/>
+              </w:rPr>
+              <w:t>No promovido</w:t>
+            </w:r>
+          </w:p>
+        </w:tc>
+      </w:tr>
+      <w:tr>
+        <w:trPr>
+          <w:cantSplit/>
+        </w:trPr>
+        <w:tc>
+          <w:tcPr>
+            <w:tcW w:type="dxa" w:w="4989"/>
+            <w:vAlign w:val="center"/>
+            <w:tcMar>
+              <w:top w:w="85" w:type="dxa"/>
+              <w:bottom w:w="85" w:type="dxa"/>
+              <w:left w:w="100" w:type="dxa"/>
+              <w:right w:w="100" w:type="dxa"/>
+            </w:tcMar>
+            <w:shd w:fill="F2F5F7"/>
+          </w:tcPr>
+          <w:p>
+            <w:pPr>
+              <w:spacing w:after="0" w:line="240" w:lineRule="auto"/>
+            </w:pPr>
+            <w:r>
+              <w:rPr>
+                <w:sz w:val="19"/>
+              </w:rPr>
+              <w:t>Fabricación originada en pedido por División</w:t>
+            </w:r>
+          </w:p>
+        </w:tc>
+        <w:tc>
+          <w:tcPr>
+            <w:tcW w:type="dxa" w:w="2211"/>
+            <w:vAlign w:val="center"/>
+            <w:tcMar>
+              <w:top w:w="85" w:type="dxa"/>
+              <w:bottom w:w="85" w:type="dxa"/>
+              <w:left w:w="100" w:type="dxa"/>
+              <w:right w:w="100" w:type="dxa"/>
+            </w:tcMar>
+            <w:shd w:fill="F2F5F7"/>
+          </w:tcPr>
+          <w:p>
+            <w:pPr>
+              <w:spacing w:after="0" w:line="240" w:lineRule="auto"/>
+            </w:pPr>
+            <w:r>
+              <w:rPr>
+                <w:sz w:val="19"/>
+              </w:rPr>
+              <w:t>Implementado; validación Local</w:t>
+            </w:r>
+          </w:p>
+        </w:tc>
+        <w:tc>
+          <w:tcPr>
+            <w:tcW w:type="dxa" w:w="2211"/>
+            <w:vAlign w:val="center"/>
+            <w:tcMar>
+              <w:top w:w="85" w:type="dxa"/>
+              <w:bottom w:w="85" w:type="dxa"/>
+              <w:left w:w="100" w:type="dxa"/>
+              <w:right w:w="100" w:type="dxa"/>
+            </w:tcMar>
+            <w:shd w:fill="F2F5F7"/>
+          </w:tcPr>
+          <w:p>
+            <w:pPr>
+              <w:spacing w:after="0" w:line="240" w:lineRule="auto"/>
+            </w:pPr>
+            <w:r>
+              <w:rPr>
+                <w:sz w:val="19"/>
+              </w:rPr>
+              <w:t>No promovido</w:t>
+            </w:r>
+          </w:p>
+        </w:tc>
+      </w:tr>
+      <w:tr>
+        <w:trPr>
+          <w:cantSplit/>
+        </w:trPr>
+        <w:tc>
+          <w:tcPr>
+            <w:tcW w:type="dxa" w:w="4989"/>
+            <w:vAlign w:val="center"/>
+            <w:tcMar>
+              <w:top w:w="85" w:type="dxa"/>
+              <w:bottom w:w="85" w:type="dxa"/>
+              <w:left w:w="100" w:type="dxa"/>
+              <w:right w:w="100" w:type="dxa"/>
+            </w:tcMar>
+            <w:shd w:fill="FFFFFF"/>
+          </w:tcPr>
+          <w:p>
+            <w:pPr>
+              <w:spacing w:after="0" w:line="240" w:lineRule="auto"/>
+            </w:pPr>
+            <w:r>
+              <w:rPr>
+                <w:sz w:val="19"/>
+              </w:rPr>
+              <w:t>Costo unitario estimado confirmado por División para cotizaciones</w:t>
+            </w:r>
+          </w:p>
+        </w:tc>
+        <w:tc>
+          <w:tcPr>
+            <w:tcW w:type="dxa" w:w="2211"/>
+            <w:vAlign w:val="center"/>
+            <w:tcMar>
+              <w:top w:w="85" w:type="dxa"/>
+              <w:bottom w:w="85" w:type="dxa"/>
+              <w:left w:w="100" w:type="dxa"/>
+              <w:right w:w="100" w:type="dxa"/>
+            </w:tcMar>
+            <w:shd w:fill="FFFFFF"/>
+          </w:tcPr>
+          <w:p>
+            <w:pPr>
+              <w:spacing w:after="0" w:line="240" w:lineRule="auto"/>
+            </w:pPr>
+            <w:r>
+              <w:rPr>
+                <w:sz w:val="19"/>
+              </w:rPr>
+              <w:t>Disponible sólo Local</w:t>
+            </w:r>
+          </w:p>
+        </w:tc>
+        <w:tc>
+          <w:tcPr>
+            <w:tcW w:type="dxa" w:w="2211"/>
+            <w:vAlign w:val="center"/>
+            <w:tcMar>
+              <w:top w:w="85" w:type="dxa"/>
+              <w:bottom w:w="85" w:type="dxa"/>
+              <w:left w:w="100" w:type="dxa"/>
+              <w:right w:w="100" w:type="dxa"/>
+            </w:tcMar>
+            <w:shd w:fill="FFFFFF"/>
+          </w:tcPr>
+          <w:p>
+            <w:pPr>
+              <w:spacing w:after="0" w:line="240" w:lineRule="auto"/>
+            </w:pPr>
+            <w:r>
+              <w:rPr>
+                <w:sz w:val="19"/>
+              </w:rPr>
+              <w:t>No promovido</w:t>
+            </w:r>
+          </w:p>
+        </w:tc>
+      </w:tr>
+      <w:tr>
+        <w:trPr>
+          <w:cantSplit/>
+        </w:trPr>
+        <w:tc>
+          <w:tcPr>
+            <w:tcW w:type="dxa" w:w="4989"/>
+            <w:vAlign w:val="center"/>
+            <w:tcMar>
+              <w:top w:w="85" w:type="dxa"/>
+              <w:bottom w:w="85" w:type="dxa"/>
+              <w:left w:w="100" w:type="dxa"/>
+              <w:right w:w="100" w:type="dxa"/>
+            </w:tcMar>
+            <w:shd w:fill="F2F5F7"/>
+          </w:tcPr>
+          <w:p>
+            <w:pPr>
+              <w:spacing w:after="0" w:line="240" w:lineRule="auto"/>
+            </w:pPr>
+            <w:r>
+              <w:rPr>
+                <w:sz w:val="19"/>
+              </w:rPr>
+              <w:t>Calendarios configurables, turnos, festivos y ausencias</w:t>
+            </w:r>
+          </w:p>
+        </w:tc>
+        <w:tc>
+          <w:tcPr>
+            <w:tcW w:type="dxa" w:w="2211"/>
+            <w:vAlign w:val="center"/>
+            <w:tcMar>
+              <w:top w:w="85" w:type="dxa"/>
+              <w:bottom w:w="85" w:type="dxa"/>
+              <w:left w:w="100" w:type="dxa"/>
+              <w:right w:w="100" w:type="dxa"/>
+            </w:tcMar>
+            <w:shd w:fill="F2F5F7"/>
+          </w:tcPr>
+          <w:p>
+            <w:pPr>
+              <w:spacing w:after="0" w:line="240" w:lineRule="auto"/>
+            </w:pPr>
+            <w:r>
+              <w:rPr>
+                <w:sz w:val="19"/>
+              </w:rPr>
               <w:t>No disponible</w:t>
             </w:r>
           </w:p>
@@ -886,7 +1114,7 @@
               <w:left w:w="100" w:type="dxa"/>
               <w:right w:w="100" w:type="dxa"/>
             </w:tcMar>
-            <w:shd w:fill="FFFFFF"/>
+            <w:shd w:fill="F2F5F7"/>
           </w:tcPr>
           <w:p>
             <w:pPr>
@@ -1616,7 +1844,7 @@
         <w:ind w:left="283" w:hanging="283"/>
       </w:pPr>
       <w:r>
-        <w:t>1. Seleccione una receta aprobada, cantidad, inicio planeado, días productivos, fecha requerida, prioridad y responsables.</w:t>
+        <w:t>1. En Local seleccione explícitamente la División autorizada y después una receta aprobada entre las elegibles. Sociedad y moneda de costo se derivan de esa División. Capture cantidad, inicio planeado, días productivos, fecha requerida, prioridad y responsables de esa División. Cambiar División invalida las selecciones y validación anteriores. En QA se conserva el recorrido base.</w:t>
       </w:r>
     </w:p>
     <w:p>
@@ -1624,7 +1852,7 @@
         <w:ind w:left="283" w:hanging="283"/>
       </w:pPr>
       <w:r>
-        <w:t>2. Revise el horizonte y el desglose diario de material, mano de obra y maquinaria.</w:t>
+        <w:t>2. Revise el horizonte y el desglose diario de material, mano de obra y maquinaria. En Local los materiales deben tener existencias/costos compatibles en almacenes de la División y las tarifas de puesto/máquina deben estar confirmadas en moneda Sociedad. Cero es válido; una tarifa histórica sin moneda no es utilizable.</w:t>
       </w:r>
     </w:p>
     <w:p>
@@ -1675,7 +1903,7 @@
         <w:t>Producción &gt; Órdenes</w:t>
       </w:r>
       <w:r>
-        <w:t xml:space="preserve">. Si la receta corresponde a un servicio, registre la evidencia inicial antes de pasar a espera de recursos o iniciar (mejora Local pendiente de QA). Inicie la orden. </w:t>
+        <w:t xml:space="preserve">. Si la receta corresponde a un servicio, registre la evidencia inicial antes de pasar a espera de recursos o iniciar. Inicie la orden. </w:t>
       </w:r>
       <w:r>
         <w:rPr>
@@ -1684,7 +1912,7 @@
         <w:t>En producción</w:t>
       </w:r>
       <w:r>
-        <w:t xml:space="preserve"> exige la salida completa previamente confirmada y vuelve a validar responsables elegibles y maquinaria disponible. Cambiar el estatus no descuenta inventario.</w:t>
+        <w:t xml:space="preserve"> exige la salida completa previamente confirmada y vuelve a validar responsables elegibles y maquinaria disponible. En órdenes Local por División también verifica los trabajadores comprometidos y su puesto vigente; reanudar repite esas verificaciones sin cambiar las tarifas históricas. Cambiar el estatus no descuenta inventario.</w:t>
       </w:r>
     </w:p>
     <w:p>
@@ -1736,7 +1964,7 @@
     </w:p>
     <w:p>
       <w:r>
-        <w:t xml:space="preserve">Si una creación fallida dejó reservas, use </w:t>
+        <w:t xml:space="preserve">Si el resultado de un alta es incierto, conserve la captura y reintente la misma operación; no cambie de clave ni cree otra orden. El intento durable permite comprobar las partidas antes de reservar y recuperar una respuesta ya completada sin repetir efectos. Si una creación fallida dejó reservas, use </w:t>
       </w:r>
       <w:r>
         <w:rPr>
@@ -1753,6 +1981,160 @@
         <w:pStyle w:val="Heading1"/>
       </w:pPr>
       <w:r>
+        <w:t>Fabricar una partida de pedido por División</w:t>
+      </w:r>
+    </w:p>
+    <w:p>
+      <w:r>
+        <w:rPr>
+          <w:b/>
+        </w:rPr>
+        <w:t>Disponible en Local; no promovido a QA.</w:t>
+      </w:r>
+      <w:r>
+        <w:t xml:space="preserve"> La solicitud comercial fija el producto, la División, la cantidad y la unidad. Producción conserva la decisión de receta, fechas, responsables y liberación.</w:t>
+      </w:r>
+    </w:p>
+    <w:p>
+      <w:pPr>
+        <w:ind w:left="283" w:hanging="283"/>
+      </w:pPr>
+      <w:r>
+        <w:t xml:space="preserve">1. Abra </w:t>
+      </w:r>
+      <w:r>
+        <w:rPr>
+          <w:b/>
+        </w:rPr>
+        <w:t>Producción &gt; Órdenes &gt; Solicitudes desde pedidos</w:t>
+      </w:r>
+      <w:r>
+        <w:t xml:space="preserve">. Busque la solicitud y use </w:t>
+      </w:r>
+      <w:r>
+        <w:rPr>
+          <w:b/>
+        </w:rPr>
+        <w:t>Anterior/Siguiente</w:t>
+      </w:r>
+      <w:r>
+        <w:t xml:space="preserve"> cuando haya más resultados. También puede entrar con </w:t>
+      </w:r>
+      <w:r>
+        <w:rPr>
+          <w:b/>
+        </w:rPr>
+        <w:t>Planificar orden de producción</w:t>
+      </w:r>
+      <w:r>
+        <w:t xml:space="preserve"> desde el seguimiento del pedido en Ventas si dispone del permiso de liberación.</w:t>
+      </w:r>
+    </w:p>
+    <w:p>
+      <w:pPr>
+        <w:ind w:left="283" w:hanging="283"/>
+      </w:pPr>
+      <w:r>
+        <w:t xml:space="preserve">2. Pulse </w:t>
+      </w:r>
+      <w:r>
+        <w:rPr>
+          <w:b/>
+        </w:rPr>
+        <w:t>Planificar solicitud</w:t>
+      </w:r>
+      <w:r>
+        <w:t>. Revise los datos de origen de sólo lectura; no sustituya una partida comercial mediante una orden manual.</w:t>
+      </w:r>
+    </w:p>
+    <w:p>
+      <w:pPr>
+        <w:ind w:left="283" w:hanging="283"/>
+      </w:pPr>
+      <w:r>
+        <w:t>3. Seleccione una receta aprobada del producto solicitado y de la División. Capture inicio planeado, días productivos, fecha requerida, prioridad, responsable general y responsables de etapa. Sociedad y moneda del costo se derivan de la División.</w:t>
+      </w:r>
+    </w:p>
+    <w:p>
+      <w:pPr>
+        <w:ind w:left="283" w:hanging="283"/>
+      </w:pPr>
+      <w:r>
+        <w:t xml:space="preserve">4. Use </w:t>
+      </w:r>
+      <w:r>
+        <w:rPr>
+          <w:b/>
+        </w:rPr>
+        <w:t>Validar recursos</w:t>
+      </w:r>
+      <w:r>
+        <w:t>. La validación comprueba el pedido de origen, materiales, capacidad y tarifas confirmadas; no genera una orden por sí sola.</w:t>
+      </w:r>
+    </w:p>
+    <w:p>
+      <w:pPr>
+        <w:ind w:left="283" w:hanging="283"/>
+      </w:pPr>
+      <w:r>
+        <w:t xml:space="preserve">5. Pulse </w:t>
+      </w:r>
+      <w:r>
+        <w:rPr>
+          <w:b/>
+        </w:rPr>
+        <w:t>Generar orden</w:t>
+      </w:r>
+      <w:r>
+        <w:t>. La liberación vuelve a validar el origen, reserva materiales y compromete capacidad con el mismo criterio que una orden manual por División. Cada solicitud admite una única orden.</w:t>
+      </w:r>
+    </w:p>
+    <w:p>
+      <w:pPr>
+        <w:ind w:left="283" w:hanging="283"/>
+      </w:pPr>
+      <w:r>
+        <w:t>6. Ejecute las etapas, entregue materiales y termine la orden mediante el recorrido habitual. Almacenes debe recibir físicamente el producto terminado.</w:t>
+      </w:r>
+    </w:p>
+    <w:p>
+      <w:pPr>
+        <w:ind w:left="283" w:hanging="283"/>
+      </w:pPr>
+      <w:r>
+        <w:t>7. Ventas actualiza el seguimiento y concilia la recepción con el pedido. Terminar Producción no habilita por sí solo el despacho comercial.</w:t>
+      </w:r>
+    </w:p>
+    <w:p>
+      <w:r>
+        <w:t xml:space="preserve">Consultar la bandeja requiere </w:t>
+      </w:r>
+      <w:r>
+        <w:rPr>
+          <w:rFonts w:ascii="Consolas" w:hAnsi="Consolas"/>
+          <w:sz w:val="18"/>
+        </w:rPr>
+        <w:t>production.order.read</w:t>
+      </w:r>
+      <w:r>
+        <w:t xml:space="preserve">; tener sólo permiso de liberación no habilita esa consulta. Generar la orden requiere </w:t>
+      </w:r>
+      <w:r>
+        <w:rPr>
+          <w:rFonts w:ascii="Consolas" w:hAnsi="Consolas"/>
+          <w:sz w:val="18"/>
+        </w:rPr>
+        <w:t>production.order.release</w:t>
+      </w:r>
+      <w:r>
+        <w:t xml:space="preserve"> y alcance vigente. Si la solicitud ya tiene orden, consulte la existente. Si se canceló o cambió su origen, actualice el seguimiento antes de continuar. Ante una respuesta incierta conserve la captura y reintente; si se informa recuperación pendiente, resuelva ese intento antes de crear otro o cancelar la solicitud.</w:t>
+      </w:r>
+    </w:p>
+    <w:p>
+      <w:pPr>
+        <w:pStyle w:val="Heading1"/>
+      </w:pPr>
+      <w:r>
         <w:t>Margen esperado de productos y servicios</w:t>
       </w:r>
     </w:p>
@@ -1761,7 +2143,7 @@
         <w:rPr>
           <w:b/>
         </w:rPr>
-        <w:t>Disponible en Local; pendiente de promoción a QA.</w:t>
+        <w:t>Disponible en Local y QA.</w:t>
       </w:r>
       <w:r>
         <w:t xml:space="preserve"> En </w:t>
@@ -1803,7 +2185,7 @@
         <w:rPr>
           <w:b/>
         </w:rPr>
-        <w:t>Disponible en Local; pendiente de promoción a QA.</w:t>
+        <w:t>Disponible en Local y QA.</w:t>
       </w:r>
       <w:r>
         <w:t xml:space="preserve"> Aplica únicamente a órdenes de Producción cuya receta corresponde a un servicio. Las órdenes de producto mantienen su recorrido. Las órdenes comerciales de servicio de Ventas son un flujo distinto.</w:t>
@@ -2078,7 +2460,7 @@
               <w:rPr>
                 <w:sz w:val="19"/>
               </w:rPr>
-              <w:t>Documentos PDF, TXT, DOCX o XLSX</w:t>
+              <w:t>Documentos PDF, TXT en UTF-8, DOCX o XLSX</w:t>
             </w:r>
           </w:p>
         </w:tc>
@@ -2829,7 +3211,7 @@
     </w:p>
     <w:p>
       <w:r>
-        <w:t>Al terminar una orden, Producción expone a Almacenes una proyección mínima: folio, producto vinculado, cantidad, unidad y costo unitario. El almacenista confirma una o varias recepciones. Producción no incrementa existencias por sí misma y no expone receta, responsables o costos completos al rol receptor.</w:t>
+        <w:t>Al terminar una orden, Producción expone a Almacenes una proyección mínima: folio, producto vinculado, cantidad, unidad y costo unitario. En el recorrido Local por División incluye el contexto y costo original exacto a seis decimales; Almacén valida artículo y destino elegibles en esa División y toma el costo del productor. No se captura un costo sustituto ni se infiere del maestro. El almacenista confirma una o varias recepciones. Producción no incrementa existencias por sí misma y no expone receta, responsables o costos completos al rol receptor.</w:t>
       </w:r>
     </w:p>
     <w:p>
@@ -3152,6 +3534,336 @@
         <w:t>Conserve folio de orden, estado, fase, fecha y referencia de correlación cuando aparezca. No registre salidas manuales para corregir una integración pendiente: reintente desde la acción autorizada o escale a soporte.</w:t>
       </w:r>
     </w:p>
+    <w:p>
+      <w:pPr>
+        <w:pStyle w:val="Heading1"/>
+      </w:pPr>
+      <w:r>
+        <w:t>Demoras de comunicación en Local</w:t>
+      </w:r>
+    </w:p>
+    <w:p>
+      <w:r>
+        <w:t>Mejora disponible solo en Local, pendiente de QA: la espera de cada petición incluye la descarga de la respuesta. Un fallo conserva la captura mientras permanezca abierto el formulario; no realiza un nuevo envío automáticamente. Consulte el estado del registro antes de repetir una operación cuyo resultado no se confirmó.</w:t>
+      </w:r>
+    </w:p>
+    <w:p>
+      <w:r>
+        <w:t>En órdenes de servicio, un aviso distingue la recepción y el cierre escritos ya guardados del avance pendiente de confirmar. Los campos confirmados quedan bloqueados porque la evidencia no se sobrescribe; un fallo posterior no significa que se hayan perdido esos textos.</w:t>
+      </w:r>
+    </w:p>
+    <w:p>
+      <w:pPr>
+        <w:pStyle w:val="Heading1"/>
+      </w:pPr>
+      <w:r>
+        <w:t>Asignar máquinas y productos a Divisiones</w:t>
+      </w:r>
+    </w:p>
+    <w:p>
+      <w:r>
+        <w:t>Disponible sólo en Local. Las asignaciones y consultas de máquinas respetan División y preparan el alta manual dimensionada Local. No cambian recetas, órdenes o movimientos históricos. No activa Contabilidad ni análisis de Costos.</w:t>
+      </w:r>
+    </w:p>
+    <w:p>
+      <w:r>
+        <w:t xml:space="preserve">En Producción → Productos y servicios o Recursos → Maquinaria, abra </w:t>
+      </w:r>
+      <w:r>
+        <w:rPr>
+          <w:b/>
+        </w:rPr>
+        <w:t>Asignación por División</w:t>
+      </w:r>
+      <w:r>
+        <w:t xml:space="preserve"> en la tarjeta. Necesita lectura del catálogo y una sesión con alcance organizacional vigente; para guardar necesita además actualizar ese tipo de recurso.</w:t>
+      </w:r>
+    </w:p>
+    <w:p>
+      <w:pPr>
+        <w:ind w:left="283" w:hanging="283"/>
+      </w:pPr>
+      <w:r>
+        <w:t>1. Busque una División por código o nombre y selecciónela entre las autorizadas. Sociedad se deriva de esa División.</w:t>
+      </w:r>
+    </w:p>
+    <w:p>
+      <w:pPr>
+        <w:ind w:left="283" w:hanging="283"/>
+      </w:pPr>
+      <w:r>
+        <w:t>2. Para una máquina pendiente, un usuario con alcance completo puede guardar su primera División. Después queda fija; solicite revisión si necesita corregir su ubicación. La máquina debe estar activa.</w:t>
+      </w:r>
+    </w:p>
+    <w:p>
+      <w:pPr>
+        <w:ind w:left="283" w:hanging="283"/>
+      </w:pPr>
+      <w:r>
+        <w:t xml:space="preserve">3. Para un producto o servicio, elija opcionalmente un centro predeterminado activo de esa División. </w:t>
+      </w:r>
+      <w:r>
+        <w:rPr>
+          <w:b/>
+        </w:rPr>
+        <w:t>Sin centro</w:t>
+      </w:r>
+      <w:r>
+        <w:t xml:space="preserve"> conserva la asignación sin referencia. Cambiar de División limpia la selección anterior.</w:t>
+      </w:r>
+    </w:p>
+    <w:p>
+      <w:pPr>
+        <w:ind w:left="283" w:hanging="283"/>
+      </w:pPr>
+      <w:r>
+        <w:t>4. Guarde. El mismo producto/servicio puede tener asignaciones en varias Divisiones sin duplicar su ficha. Sólo los maestros activos permiten activar asignaciones.</w:t>
+      </w:r>
+    </w:p>
+    <w:p>
+      <w:pPr>
+        <w:ind w:left="283" w:hanging="283"/>
+      </w:pPr>
+      <w:r>
+        <w:t xml:space="preserve">5. En </w:t>
+      </w:r>
+      <w:r>
+        <w:rPr>
+          <w:b/>
+        </w:rPr>
+        <w:t>Asignaciones existentes</w:t>
+      </w:r>
+      <w:r>
+        <w:t>, abra una asignación para consultar o cambiar su estado. Desactivarla conserva el centro histórico; reactivarla vuelve a validar el recurso, División y centro.</w:t>
+      </w:r>
+    </w:p>
+    <w:p>
+      <w:r>
+        <w:t>Los centros no son obligatorios por preparar el sistema. Se exigirán únicamente en los flujos de imputación habilitados. Sin acceso al catálogo, se conserva una referencia existente; para validar una asignación activa con centro necesita acceso y disponibilidad de Costing. Desactivar permite conservar historia aunque ese catálogo no esté disponible.</w:t>
+      </w:r>
+    </w:p>
+    <w:p>
+      <w:pPr>
+        <w:pStyle w:val="Heading2"/>
+      </w:pPr>
+      <w:r>
+        <w:t>Confirmar costo estimado para Ventas en Local</w:t>
+      </w:r>
+    </w:p>
+    <w:p>
+      <w:pPr>
+        <w:ind w:left="283" w:hanging="283"/>
+      </w:pPr>
+      <w:r>
+        <w:t xml:space="preserve">1. En </w:t>
+      </w:r>
+      <w:r>
+        <w:rPr>
+          <w:b/>
+        </w:rPr>
+        <w:t>Productos y servicios &gt; Asignación por División</w:t>
+      </w:r>
+      <w:r>
+        <w:t>, guarde y seleccione una asignación activa. Revise la Sociedad y su moneda base; el costo se captura por unidad del producto o servicio en esa moneda.</w:t>
+      </w:r>
+    </w:p>
+    <w:p>
+      <w:pPr>
+        <w:ind w:left="283" w:hanging="283"/>
+      </w:pPr>
+      <w:r>
+        <w:t xml:space="preserve">2. Capture el costo unitario con hasta seis decimales y pulse </w:t>
+      </w:r>
+      <w:r>
+        <w:rPr>
+          <w:b/>
+        </w:rPr>
+        <w:t>Confirmar costo</w:t>
+      </w:r>
+      <w:r>
+        <w:t>. Cero es válido. Sólo quien puede actualizar el producto o servicio realiza esta acción; un conflicto de revisión requiere volver a abrir la asignación.</w:t>
+      </w:r>
+    </w:p>
+    <w:p>
+      <w:pPr>
+        <w:ind w:left="283" w:hanging="283"/>
+      </w:pPr>
+      <w:r>
+        <w:t xml:space="preserve">3. Para dejar de usarlo en cotizaciones nuevas, pulse </w:t>
+      </w:r>
+      <w:r>
+        <w:rPr>
+          <w:b/>
+        </w:rPr>
+        <w:t>Retirar costo confirmado</w:t>
+      </w:r>
+      <w:r>
+        <w:t>. La acción es explícita y no borra documentos anteriores. Una asignación inactiva no ofrece confirmación nueva.</w:t>
+      </w:r>
+    </w:p>
+    <w:p>
+      <w:r>
+        <w:t>Ventas utiliza sólo la confirmación de la División correspondiente. Si no existe o cambió la Sociedad o su moneda base, el estimado queda pendiente y Ventas no sustituye automáticamente el costo global del maestro. Este costo es una referencia comercial, no el costo real de una orden ni un asiento contable.</w:t>
+      </w:r>
+    </w:p>
+    <w:p>
+      <w:r>
+        <w:t>Un rechazo conserva la captura. Si existe un conflicto de revisión, vuelva a abrir la asignación para revisar lo guardado antes de reintentar. La falta de permisos requiere un administrador autorizado. El texto de centro de costos del maestro y el área de la máquina son datos heredados: no se convierten automáticamente a estas referencias. Los registros existentes permanecen pendientes hasta asignarlos explícitamente.</w:t>
+      </w:r>
+    </w:p>
+    <w:p>
+      <w:pPr>
+        <w:pStyle w:val="Heading1"/>
+      </w:pPr>
+      <w:r>
+        <w:t>Confirmar la tarifa de una máquina</w:t>
+      </w:r>
+    </w:p>
+    <w:p>
+      <w:r>
+        <w:t xml:space="preserve">Disponible sólo en Local. En </w:t>
+      </w:r>
+      <w:r>
+        <w:rPr>
+          <w:b/>
+        </w:rPr>
+        <w:t>Producción → Recursos → Maquinaria</w:t>
+      </w:r>
+      <w:r>
+        <w:t xml:space="preserve">, abra </w:t>
+      </w:r>
+      <w:r>
+        <w:rPr>
+          <w:b/>
+        </w:rPr>
+        <w:t>Asignación por División</w:t>
+      </w:r>
+      <w:r>
+        <w:t>. Necesita consultar la máquina y permiso para actualizarla. La División física se asigna explícitamente y después queda fija.</w:t>
+      </w:r>
+    </w:p>
+    <w:p>
+      <w:pPr>
+        <w:ind w:left="283" w:hanging="283"/>
+      </w:pPr>
+      <w:r>
+        <w:t xml:space="preserve">1. Revise la División y la </w:t>
+      </w:r>
+      <w:r>
+        <w:rPr>
+          <w:b/>
+        </w:rPr>
+        <w:t>Moneda base de la Sociedad</w:t>
+      </w:r>
+      <w:r>
+        <w:t xml:space="preserve"> mostrada. La moneda se deriva de esa División y no se elige por separado.</w:t>
+      </w:r>
+    </w:p>
+    <w:p>
+      <w:pPr>
+        <w:ind w:left="283" w:hanging="283"/>
+      </w:pPr>
+      <w:r>
+        <w:t xml:space="preserve">2. Capture </w:t>
+      </w:r>
+      <w:r>
+        <w:rPr>
+          <w:b/>
+        </w:rPr>
+        <w:t>Costo por minuto</w:t>
+      </w:r>
+      <w:r>
+        <w:t>; cero es válido y se permiten hasta seis decimales. Revise el importe completo antes de confirmar.</w:t>
+      </w:r>
+    </w:p>
+    <w:p>
+      <w:pPr>
+        <w:ind w:left="283" w:hanging="283"/>
+      </w:pPr>
+      <w:r>
+        <w:t xml:space="preserve">3. Marque </w:t>
+      </w:r>
+      <w:r>
+        <w:rPr>
+          <w:b/>
+        </w:rPr>
+        <w:t>Confirmo este importe en la moneda indicada para operaciones futuras</w:t>
+      </w:r>
+      <w:r>
+        <w:t>. La casilla inicia sin marcar; guardar la División por sí solo no confirma la moneda.</w:t>
+      </w:r>
+    </w:p>
+    <w:p>
+      <w:pPr>
+        <w:ind w:left="283" w:hanging="283"/>
+      </w:pPr>
+      <w:r>
+        <w:t>4. Guarde la tarifa y espere el resultado. Ante rechazo se conserva la captura; revise moneda, permisos y contexto antes de reintentar.</w:t>
+      </w:r>
+    </w:p>
+    <w:p>
+      <w:r>
+        <w:t>Una tarifa anterior sin moneda confirmada sigue pendiente: no se convierte ni se etiqueta automáticamente. Si la Sociedad o su moneda cambian, vuelva a confirmar explícitamente antes de usar la tarifa como costo vigente. El editor general de la máquina conserva la tarifa confirmada al cambiar nombre, capacidad u otros datos; para modificar el costo utilice este panel específico. La tarifa no es un asiento contable.</w:t>
+      </w:r>
+    </w:p>
+    <w:p>
+      <w:pPr>
+        <w:pStyle w:val="Heading1"/>
+      </w:pPr>
+      <w:r>
+        <w:t>Consultar capacidad de máquinas por División</w:t>
+      </w:r>
+    </w:p>
+    <w:p>
+      <w:r>
+        <w:t xml:space="preserve">En el panel </w:t>
+      </w:r>
+      <w:r>
+        <w:rPr>
+          <w:b/>
+        </w:rPr>
+        <w:t>Asignación por División</w:t>
+      </w:r>
+      <w:r>
+        <w:t>, seleccione la fecha y consulte la capacidad. La pantalla muestra hasta 25 máquinas elegibles con su tarifa confirmada y minutos disponibles después de compromisos de ese día. La fecha es obligatoria; el calendario base actual tiene capacidad cero los fines de semana.</w:t>
+      </w:r>
+    </w:p>
+    <w:p>
+      <w:r>
+        <w:t>La consulta considera la misma máquina física y todos sus compromisos activos del día, incluidas órdenes anteriores sin contexto. No libera ni reserva una máquina. Una máquina inactiva, en mantenimiento o sin tarifa confirmada vigente no debe interpretarse como disponible por conservar su registro histórico.</w:t>
+      </w:r>
+    </w:p>
+    <w:p>
+      <w:r>
+        <w:t>La consulta de RH, en cambio, presenta capacidad nominal de trabajadores compartidos y no descuenta ocupación productiva. No sume sus minutos entre Divisiones ni los interprete como disponibilidad libre. Las órdenes manuales Local combinan esa identidad compartida con compromisos globales por persona/día y los compromisos de máquinas para calcular disponibilidad. Si hay compromisos laborales antiguos sin personas identificadas, se bloquea el solapamiento para revisión; no se asignan personas por inferencia. Cancelar libera capacidad conforme al ciclo de la orden. El calendario sigue de lunes a viernes. Esta consulta por sí sola no reserva recursos. La fabricación desde pedidos se planifica mediante una solicitud vinculada; su recepción y conciliación comercial son pasos explícitos.</w:t>
+      </w:r>
+    </w:p>
+    <w:p>
+      <w:pPr>
+        <w:pStyle w:val="Heading1"/>
+      </w:pPr>
+      <w:r>
+        <w:t>Documentos relacionados</w:t>
+      </w:r>
+    </w:p>
+    <w:p>
+      <w:r>
+        <w:t>Registro de esta fuente y su Word (../REGISTRO.md) · Ficha funcional (../../../modulos/01_produccion.md) · Estado por ambiente (../../contexto/ESTADO_ACTUAL.md) · Control de integración por submódulo (../../contexto/CONTROL_CONTABLE.md).</w:t>
+      </w:r>
+    </w:p>
+    <w:p>
+      <w:pPr>
+        <w:pStyle w:val="Heading1"/>
+      </w:pPr>
+      <w:r>
+        <w:t>Imprimir ordenes con identidad de Division en Local</w:t>
+      </w:r>
+    </w:p>
+    <w:p>
+      <w:r>
+        <w:t>Al liberar una orden con contexto, Produccion conserva la identidad de Emisor, Sociedad, Division y la plantilla efectiva. La impresion posterior usa esa copia, incluso si Administracion cambia la plantilla. Una orden antigua sin copia de presentacion informa que no puede reconstruir su aspecto historico.</w:t>
+      </w:r>
+    </w:p>
     <w:sectPr>
       <w:footerReference w:type="default" r:id="rId9"/>
       <w:pgSz w:w="12240" w:h="15840"/>
@@ -3174,7 +3886,7 @@
         <w:color w:val="464646"/>
         <w:sz w:val="16"/>
       </w:rPr>
-      <w:t xml:space="preserve">ERClave  |  Local / QA pendiente  |  14 septiembre 2026  |  </w:t>
+      <w:t xml:space="preserve">ERClave  |  Alcance y revisión en la portada  |  </w:t>
     </w:r>
     <w:fldSimple w:instr="PAGE"/>
   </w:p>

</xml_diff>